<commit_message>
docs: finalize reproducible soutenance deliverables
</commit_message>
<xml_diff>
--- a/outputs/rapport-technique-openagenda-rag.docx
+++ b/outputs/rapport-technique-openagenda-rag.docx
@@ -2064,6 +2064,36 @@
       </w:r>
       <w:r>
         <w:t>Jeu annoté SHA-256 : baa353ade6616233685ddc08cf0d28f24b56754f69631ced12c7b635da65b502.</w:t>
+      </w:r>
+    </w:p>
+    <w:p>
+      <w:pPr>
+        <w:ind w:left="255" w:hanging="142"/>
+      </w:pPr>
+      <w:r>
+        <w:rPr>
+          <w:b/>
+          <w:color w:val="E77C3C"/>
+        </w:rPr>
+        <w:t xml:space="preserve">• </w:t>
+      </w:r>
+      <w:r>
+        <w:t>Manifeste FAISS SHA-256 : 0d8c452633033b6dfd89afaa7069369dfbe65c501821ce3d8fc8998021922fb9.</w:t>
+      </w:r>
+    </w:p>
+    <w:p>
+      <w:pPr>
+        <w:ind w:left="255" w:hanging="142"/>
+      </w:pPr>
+      <w:r>
+        <w:rPr>
+          <w:b/>
+          <w:color w:val="E77C3C"/>
+        </w:rPr>
+        <w:t xml:space="preserve">• </w:t>
+      </w:r>
+      <w:r>
+        <w:t>Commit de l'évaluation : 07365f3.</w:t>
       </w:r>
     </w:p>
     <w:p>

</xml_diff>